<commit_message>
forced zone commands: force flag on start/restart/reset, Forcemode toggle, all-zones buttons; spec updated in json/md/docx
</commit_message>
<xml_diff>
--- a/docs/Протокол_мастера.docx
+++ b/docs/Протокол_мастера.docx
@@ -3504,6 +3504,20 @@
               <w:t xml:space="preserve">uuid : string</w:t>
             </w:r>
           </w:p>
+          <w:p>
+            <w:pPr>
+              <w:spacing w:after="0" w:line="252"/>
+            </w:pPr>
+            <w:r>
+              <w:rPr>
+                <w:rFonts w:ascii="Consolas" w:cs="Consolas" w:eastAsia="Consolas" w:hAnsi="Consolas"/>
+                <w:color w:val="1B1B1F"/>
+                <w:sz w:val="18"/>
+                <w:szCs w:val="18"/>
+              </w:rPr>
+              <w:t xml:space="preserve">force : 0 / 1</w:t>
+            </w:r>
+          </w:p>
         </w:tc>
         <w:tc>
           <w:tcPr>
@@ -3583,6 +3597,20 @@
               <w:t xml:space="preserve">uuid : string</w:t>
             </w:r>
           </w:p>
+          <w:p>
+            <w:pPr>
+              <w:spacing w:after="0" w:line="252"/>
+            </w:pPr>
+            <w:r>
+              <w:rPr>
+                <w:rFonts w:ascii="Consolas" w:cs="Consolas" w:eastAsia="Consolas" w:hAnsi="Consolas"/>
+                <w:color w:val="1B1B1F"/>
+                <w:sz w:val="18"/>
+                <w:szCs w:val="18"/>
+              </w:rPr>
+              <w:t xml:space="preserve">force : 0 / 1</w:t>
+            </w:r>
+          </w:p>
         </w:tc>
         <w:tc>
           <w:tcPr>
@@ -3661,6 +3689,20 @@
               <w:t xml:space="preserve">1</w:t>
             </w:r>
           </w:p>
+          <w:p>
+            <w:pPr>
+              <w:spacing w:after="0" w:line="252"/>
+            </w:pPr>
+            <w:r>
+              <w:rPr>
+                <w:rFonts w:ascii="Consolas" w:cs="Consolas" w:eastAsia="Consolas" w:hAnsi="Consolas"/>
+                <w:color w:val="1B1B1F"/>
+                <w:sz w:val="18"/>
+                <w:szCs w:val="18"/>
+              </w:rPr>
+              <w:t xml:space="preserve">force : 0 / 1</w:t>
+            </w:r>
+          </w:p>
         </w:tc>
         <w:tc>
           <w:tcPr>
@@ -4113,6 +4155,268 @@
           <w:szCs w:val="21"/>
         </w:rPr>
         <w:t xml:space="preserve"/>
+      </w:r>
+    </w:p>
+    <w:p>
+      <w:pPr>
+        <w:spacing w:after="100" w:line="276"/>
+      </w:pPr>
+      <w:r>
+        <w:rPr>
+          <w:rFonts w:ascii="Calibri" w:cs="Calibri" w:eastAsia="Calibri" w:hAnsi="Calibri"/>
+          <w:b/>
+          <w:bCs/>
+          <w:color w:val="1B1B1F"/>
+          <w:sz w:val="21"/>
+          <w:szCs w:val="21"/>
+        </w:rPr>
+        <w:t xml:space="preserve">Принудительный режим:</w:t>
+      </w:r>
+    </w:p>
+    <w:p>
+      <w:pPr>
+        <w:spacing w:after="60" w:line="276"/>
+      </w:pPr>
+      <w:r>
+        <w:rPr>
+          <w:rFonts w:ascii="Calibri" w:cs="Calibri" w:eastAsia="Calibri" w:hAnsi="Calibri"/>
+          <w:color w:val="1B1B1F"/>
+          <w:sz w:val="21"/>
+          <w:szCs w:val="21"/>
+        </w:rPr>
+        <w:t xml:space="preserve">У команд </w:t>
+      </w:r>
+      <w:r>
+        <w:rPr>
+          <w:rFonts w:ascii="Consolas" w:cs="Consolas" w:eastAsia="Consolas" w:hAnsi="Consolas"/>
+          <w:color w:val="1B1B1F"/>
+          <w:sz w:val="19"/>
+          <w:szCs w:val="19"/>
+        </w:rPr>
+        <w:t xml:space="preserve">start</w:t>
+      </w:r>
+      <w:r>
+        <w:rPr>
+          <w:rFonts w:ascii="Calibri" w:cs="Calibri" w:eastAsia="Calibri" w:hAnsi="Calibri"/>
+          <w:color w:val="1B1B1F"/>
+          <w:sz w:val="21"/>
+          <w:szCs w:val="21"/>
+        </w:rPr>
+        <w:t xml:space="preserve">, </w:t>
+      </w:r>
+      <w:r>
+        <w:rPr>
+          <w:rFonts w:ascii="Consolas" w:cs="Consolas" w:eastAsia="Consolas" w:hAnsi="Consolas"/>
+          <w:color w:val="1B1B1F"/>
+          <w:sz w:val="19"/>
+          <w:szCs w:val="19"/>
+        </w:rPr>
+        <w:t xml:space="preserve">restart</w:t>
+      </w:r>
+      <w:r>
+        <w:rPr>
+          <w:rFonts w:ascii="Calibri" w:cs="Calibri" w:eastAsia="Calibri" w:hAnsi="Calibri"/>
+          <w:color w:val="1B1B1F"/>
+          <w:sz w:val="21"/>
+          <w:szCs w:val="21"/>
+        </w:rPr>
+        <w:t xml:space="preserve"> и </w:t>
+      </w:r>
+      <w:r>
+        <w:rPr>
+          <w:rFonts w:ascii="Consolas" w:cs="Consolas" w:eastAsia="Consolas" w:hAnsi="Consolas"/>
+          <w:color w:val="1B1B1F"/>
+          <w:sz w:val="19"/>
+          <w:szCs w:val="19"/>
+        </w:rPr>
+        <w:t xml:space="preserve">reset</w:t>
+      </w:r>
+      <w:r>
+        <w:rPr>
+          <w:rFonts w:ascii="Calibri" w:cs="Calibri" w:eastAsia="Calibri" w:hAnsi="Calibri"/>
+          <w:color w:val="1B1B1F"/>
+          <w:sz w:val="21"/>
+          <w:szCs w:val="21"/>
+        </w:rPr>
+        <w:t xml:space="preserve"> последним аргументом идёт флаг </w:t>
+      </w:r>
+      <w:r>
+        <w:rPr>
+          <w:rFonts w:ascii="Consolas" w:cs="Consolas" w:eastAsia="Consolas" w:hAnsi="Consolas"/>
+          <w:color w:val="1B1B1F"/>
+          <w:sz w:val="19"/>
+          <w:szCs w:val="19"/>
+        </w:rPr>
+        <w:t xml:space="preserve">force</w:t>
+      </w:r>
+      <w:r>
+        <w:rPr>
+          <w:rFonts w:ascii="Calibri" w:cs="Calibri" w:eastAsia="Calibri" w:hAnsi="Calibri"/>
+          <w:color w:val="1B1B1F"/>
+          <w:sz w:val="21"/>
+          <w:szCs w:val="21"/>
+        </w:rPr>
+        <w:t xml:space="preserve">.</w:t>
+      </w:r>
+    </w:p>
+    <w:p>
+      <w:pPr>
+        <w:pStyle w:val="ListParagraph"/>
+        <w:numPr>
+          <w:ilvl w:val="0"/>
+          <w:numId w:val="2"/>
+        </w:numPr>
+        <w:spacing w:after="80" w:line="276"/>
+      </w:pPr>
+      <w:r>
+        <w:rPr>
+          <w:rFonts w:ascii="Calibri" w:cs="Calibri" w:eastAsia="Calibri" w:hAnsi="Calibri"/>
+          <w:color w:val="1B1B1F"/>
+          <w:sz w:val="21"/>
+          <w:szCs w:val="21"/>
+        </w:rPr>
+        <w:t xml:space="preserve">force = 0 — штатно: зона запускается по своей логике, ждёт гостя, уважает свои блокировки.</w:t>
+      </w:r>
+    </w:p>
+    <w:p>
+      <w:pPr>
+        <w:pStyle w:val="ListParagraph"/>
+        <w:numPr>
+          <w:ilvl w:val="0"/>
+          <w:numId w:val="2"/>
+        </w:numPr>
+        <w:spacing w:after="80" w:line="276"/>
+      </w:pPr>
+      <w:r>
+        <w:rPr>
+          <w:rFonts w:ascii="Calibri" w:cs="Calibri" w:eastAsia="Calibri" w:hAnsi="Calibri"/>
+          <w:color w:val="1B1B1F"/>
+          <w:sz w:val="21"/>
+          <w:szCs w:val="21"/>
+        </w:rPr>
+        <w:t xml:space="preserve">force = 1 — зона обязана немедленно прервать что делает и выполнить команду с нуля, игнорируя внутренние блокировки и отсутствие сессии.</w:t>
+      </w:r>
+    </w:p>
+    <w:p>
+      <w:pPr>
+        <w:spacing w:after="120" w:line="276"/>
+      </w:pPr>
+      <w:r>
+        <w:rPr>
+          <w:rFonts w:ascii="Calibri" w:cs="Calibri" w:eastAsia="Calibri" w:hAnsi="Calibri"/>
+          <w:color w:val="1B1B1F"/>
+          <w:sz w:val="21"/>
+          <w:szCs w:val="21"/>
+        </w:rPr>
+        <w:t xml:space="preserve"/>
+      </w:r>
+    </w:p>
+    <w:p>
+      <w:pPr>
+        <w:spacing w:after="160" w:line="276"/>
+      </w:pPr>
+      <w:r>
+        <w:rPr>
+          <w:rFonts w:ascii="Calibri" w:cs="Calibri" w:eastAsia="Calibri" w:hAnsi="Calibri"/>
+          <w:color w:val="1B1B1F"/>
+          <w:sz w:val="21"/>
+          <w:szCs w:val="21"/>
+        </w:rPr>
+        <w:t xml:space="preserve">Включается тумблером </w:t>
+      </w:r>
+      <w:r>
+        <w:rPr>
+          <w:rFonts w:ascii="Calibri" w:cs="Calibri" w:eastAsia="Calibri" w:hAnsi="Calibri"/>
+          <w:b/>
+          <w:bCs/>
+          <w:color w:val="1B1B1F"/>
+          <w:sz w:val="21"/>
+          <w:szCs w:val="21"/>
+        </w:rPr>
+        <w:t xml:space="preserve">ПРИНУДИТЕЛЬНО</w:t>
+      </w:r>
+      <w:r>
+        <w:rPr>
+          <w:rFonts w:ascii="Calibri" w:cs="Calibri" w:eastAsia="Calibri" w:hAnsi="Calibri"/>
+          <w:color w:val="1B1B1F"/>
+          <w:sz w:val="21"/>
+          <w:szCs w:val="21"/>
+        </w:rPr>
+        <w:t xml:space="preserve"> в пульте (пара </w:t>
+      </w:r>
+      <w:r>
+        <w:rPr>
+          <w:rFonts w:ascii="Consolas" w:cs="Consolas" w:eastAsia="Consolas" w:hAnsi="Consolas"/>
+          <w:color w:val="1B1B1F"/>
+          <w:sz w:val="19"/>
+          <w:szCs w:val="19"/>
+        </w:rPr>
+        <w:t xml:space="preserve">Forcemode</w:t>
+      </w:r>
+      <w:r>
+        <w:rPr>
+          <w:rFonts w:ascii="Calibri" w:cs="Calibri" w:eastAsia="Calibri" w:hAnsi="Calibri"/>
+          <w:color w:val="1B1B1F"/>
+          <w:sz w:val="21"/>
+          <w:szCs w:val="21"/>
+        </w:rPr>
+        <w:t xml:space="preserve">), тогда все команды зонам уходят с force = 1. Кнопки </w:t>
+      </w:r>
+      <w:r>
+        <w:rPr>
+          <w:rFonts w:ascii="Calibri" w:cs="Calibri" w:eastAsia="Calibri" w:hAnsi="Calibri"/>
+          <w:b/>
+          <w:bCs/>
+          <w:color w:val="1B1B1F"/>
+          <w:sz w:val="21"/>
+          <w:szCs w:val="21"/>
+        </w:rPr>
+        <w:t xml:space="preserve">ВСЕ: СТАРТ / РЕСТАРТ / СБРОС</w:t>
+      </w:r>
+      <w:r>
+        <w:rPr>
+          <w:rFonts w:ascii="Calibri" w:cs="Calibri" w:eastAsia="Calibri" w:hAnsi="Calibri"/>
+          <w:color w:val="1B1B1F"/>
+          <w:sz w:val="21"/>
+          <w:szCs w:val="21"/>
+        </w:rPr>
+        <w:t xml:space="preserve"> шлют команду каждой зоне из таблицы slaves. Из кода: </w:t>
+      </w:r>
+      <w:r>
+        <w:rPr>
+          <w:rFonts w:ascii="Consolas" w:cs="Consolas" w:eastAsia="Consolas" w:hAnsi="Consolas"/>
+          <w:color w:val="1B1B1F"/>
+          <w:sz w:val="19"/>
+          <w:szCs w:val="19"/>
+        </w:rPr>
+        <w:t xml:space="preserve">StartZone(2, force=True)</w:t>
+      </w:r>
+      <w:r>
+        <w:rPr>
+          <w:rFonts w:ascii="Calibri" w:cs="Calibri" w:eastAsia="Calibri" w:hAnsi="Calibri"/>
+          <w:color w:val="1B1B1F"/>
+          <w:sz w:val="21"/>
+          <w:szCs w:val="21"/>
+        </w:rPr>
+        <w:t xml:space="preserve">, </w:t>
+      </w:r>
+      <w:r>
+        <w:rPr>
+          <w:rFonts w:ascii="Consolas" w:cs="Consolas" w:eastAsia="Consolas" w:hAnsi="Consolas"/>
+          <w:color w:val="1B1B1F"/>
+          <w:sz w:val="19"/>
+          <w:szCs w:val="19"/>
+        </w:rPr>
+        <w:t xml:space="preserve">AllZones('restart', force=True)</w:t>
+      </w:r>
+      <w:r>
+        <w:rPr>
+          <w:rFonts w:ascii="Calibri" w:cs="Calibri" w:eastAsia="Calibri" w:hAnsi="Calibri"/>
+          <w:color w:val="1B1B1F"/>
+          <w:sz w:val="21"/>
+          <w:szCs w:val="21"/>
+        </w:rPr>
+        <w:t xml:space="preserve">.</w:t>
       </w:r>
     </w:p>
     <w:p>
@@ -5495,6 +5799,25 @@
           <w:szCs w:val="21"/>
         </w:rPr>
         <w:t xml:space="preserve">Слушать UDP 10000, отвечать на /zoneN/start, /restart, /reset.</w:t>
+      </w:r>
+    </w:p>
+    <w:p>
+      <w:pPr>
+        <w:pStyle w:val="ListParagraph"/>
+        <w:numPr>
+          <w:ilvl w:val="0"/>
+          <w:numId w:val="2"/>
+        </w:numPr>
+        <w:spacing w:after="80" w:line="276"/>
+      </w:pPr>
+      <w:r>
+        <w:rPr>
+          <w:rFonts w:ascii="Calibri" w:cs="Calibri" w:eastAsia="Calibri" w:hAnsi="Calibri"/>
+          <w:color w:val="1B1B1F"/>
+          <w:sz w:val="21"/>
+          <w:szCs w:val="21"/>
+        </w:rPr>
+        <w:t xml:space="preserve">Уважать флаг force: при force = 1 прерывать текущее состояние и стартовать с нуля, не дожидаясь гостя и не проверяя свои блокировки.</w:t>
       </w:r>
     </w:p>
     <w:p>

</xml_diff>

<commit_message>
OSC ports moved to 6000 family (zones 6000, panel->master 6001, zones->master 6002, gate 6003); panel JSON-payload uuid parsing fix; spec updated in json/md/docx
</commit_message>
<xml_diff>
--- a/docs/Протокол_мастера.docx
+++ b/docs/Протокол_мастера.docx
@@ -416,7 +416,7 @@
                 <w:sz w:val="18"/>
                 <w:szCs w:val="18"/>
               </w:rPr>
-              <w:t xml:space="preserve">10000</w:t>
+              <w:t xml:space="preserve">6000</w:t>
             </w:r>
           </w:p>
         </w:tc>
@@ -521,7 +521,7 @@
                 <w:sz w:val="18"/>
                 <w:szCs w:val="18"/>
               </w:rPr>
-              <w:t xml:space="preserve">10000</w:t>
+              <w:t xml:space="preserve">6000</w:t>
             </w:r>
           </w:p>
         </w:tc>
@@ -624,7 +624,7 @@
                 <w:sz w:val="18"/>
                 <w:szCs w:val="18"/>
               </w:rPr>
-              <w:t xml:space="preserve">10000</w:t>
+              <w:t xml:space="preserve">6000</w:t>
             </w:r>
           </w:p>
         </w:tc>
@@ -729,7 +729,7 @@
                 <w:sz w:val="18"/>
                 <w:szCs w:val="18"/>
               </w:rPr>
-              <w:t xml:space="preserve">10000</w:t>
+              <w:t xml:space="preserve">6000</w:t>
             </w:r>
           </w:p>
         </w:tc>
@@ -832,7 +832,7 @@
                 <w:sz w:val="18"/>
                 <w:szCs w:val="18"/>
               </w:rPr>
-              <w:t xml:space="preserve">10001</w:t>
+              <w:t xml:space="preserve">6003</w:t>
             </w:r>
           </w:p>
         </w:tc>
@@ -937,7 +937,7 @@
                 <w:sz w:val="18"/>
                 <w:szCs w:val="18"/>
               </w:rPr>
-              <w:t xml:space="preserve">12000</w:t>
+              <w:t xml:space="preserve">6002</w:t>
             </w:r>
           </w:p>
         </w:tc>
@@ -1040,7 +1040,7 @@
                 <w:sz w:val="18"/>
                 <w:szCs w:val="18"/>
               </w:rPr>
-              <w:t xml:space="preserve">10000</w:t>
+              <w:t xml:space="preserve">6001</w:t>
             </w:r>
           </w:p>
         </w:tc>
@@ -1238,7 +1238,7 @@
           <w:sz w:val="21"/>
           <w:szCs w:val="21"/>
         </w:rPr>
-        <w:t xml:space="preserve"> (10000) и </w:t>
+        <w:t xml:space="preserve"> (6001) и </w:t>
       </w:r>
       <w:r>
         <w:rPr>
@@ -1256,7 +1256,7 @@
           <w:sz w:val="21"/>
           <w:szCs w:val="21"/>
         </w:rPr>
-        <w:t xml:space="preserve"> (12000) на </w:t>
+        <w:t xml:space="preserve"> (6002) на </w:t>
       </w:r>
       <w:r>
         <w:rPr>
@@ -4856,7 +4856,7 @@
           <w:sz w:val="30"/>
           <w:szCs w:val="30"/>
         </w:rPr>
-        <w:t xml:space="preserve">5. Зоны → мастеру (порт 12000)</w:t>
+        <w:t xml:space="preserve">5. Зоны → мастеру (порт 6002)</w:t>
       </w:r>
     </w:p>
     <w:tbl>
@@ -5193,7 +5193,7 @@
           <w:sz w:val="30"/>
           <w:szCs w:val="30"/>
         </w:rPr>
-        <w:t xml:space="preserve">6. Тач-панель → мастеру (порт 10000)</w:t>
+        <w:t xml:space="preserve">6. Тач-панель → мастеру (порт 6001)</w:t>
       </w:r>
     </w:p>
     <w:p>
@@ -5798,7 +5798,7 @@
           <w:sz w:val="21"/>
           <w:szCs w:val="21"/>
         </w:rPr>
-        <w:t xml:space="preserve">Слушать UDP 10000, отвечать на /zoneN/start, /restart, /reset.</w:t>
+        <w:t xml:space="preserve">Слушать UDP 6000, отвечать на /zoneN/start, /restart, /reset.</w:t>
       </w:r>
     </w:p>
     <w:p>
@@ -5874,7 +5874,7 @@
           <w:sz w:val="21"/>
           <w:szCs w:val="21"/>
         </w:rPr>
-        <w:t xml:space="preserve">Слать /zoneN/sound/&lt;триггер&gt; на 10.10.10.10:12000 для звука.</w:t>
+        <w:t xml:space="preserve">Слать /zoneN/sound/&lt;триггер&gt; на 10.10.10.10:6002 для звука.</w:t>
       </w:r>
     </w:p>
     <w:p>

</xml_diff>